<commit_message>
added 1st year tasks
</commit_message>
<xml_diff>
--- a/task2_first_year.pdf.docx
+++ b/task2_first_year.pdf.docx
@@ -535,9 +535,193 @@
         <w:t>In your main function, instantiate both derived classes, initialize their inherited and unique properties, and call their respective methods to prove the inheritance chain works.</w:t>
       </w:r>
     </w:p>
-    <w:p/>
-    <w:p/>
-    <w:p/>
+    <w:p>
+      <w:pPr>
+        <w:ind w:left="360"/>
+      </w:pPr>
+    </w:p>
+    <w:p>
+      <w:r>
+        <w:rPr>
+          <w:b/>
+          <w:bCs/>
+        </w:rPr>
+        <w:t xml:space="preserve">7) </w:t>
+      </w:r>
+      <w:r>
+        <w:rPr>
+          <w:b/>
+          <w:bCs/>
+        </w:rPr>
+        <w:t>Problem Statement: Implement a Queue using a Singly Linked List</w:t>
+      </w:r>
+    </w:p>
+    <w:p>
+      <w:r>
+        <w:t xml:space="preserve">Design and implement a Queue data structure using a singly linked list. You must maintain two pointers, front and rear, to ensure that both insertion (enqueue) and deletion (dequeue) operations run in </w:t>
+      </w:r>
+      <w:r>
+        <w:rPr>
+          <w:b/>
+          <w:bCs/>
+        </w:rPr>
+        <w:t>O(1)</w:t>
+      </w:r>
+      <w:r>
+        <w:t xml:space="preserve"> time complexity.</w:t>
+      </w:r>
+    </w:p>
+    <w:p>
+      <w:pPr>
+        <w:rPr>
+          <w:b/>
+          <w:bCs/>
+        </w:rPr>
+      </w:pPr>
+      <w:r>
+        <w:rPr>
+          <w:b/>
+          <w:bCs/>
+        </w:rPr>
+        <w:t>Requirements</w:t>
+      </w:r>
+    </w:p>
+    <w:p>
+      <w:r>
+        <w:t>Implement the following classes and methods:</w:t>
+      </w:r>
+    </w:p>
+    <w:p>
+      <w:r>
+        <w:rPr>
+          <w:b/>
+          <w:bCs/>
+        </w:rPr>
+        <w:t>1. A Node struct/class:</w:t>
+      </w:r>
+    </w:p>
+    <w:p>
+      <w:pPr>
+        <w:numPr>
+          <w:ilvl w:val="0"/>
+          <w:numId w:val="7"/>
+        </w:numPr>
+      </w:pPr>
+      <w:r>
+        <w:t>data: An integer value.</w:t>
+      </w:r>
+    </w:p>
+    <w:p>
+      <w:pPr>
+        <w:numPr>
+          <w:ilvl w:val="0"/>
+          <w:numId w:val="7"/>
+        </w:numPr>
+      </w:pPr>
+      <w:r>
+        <w:t>next: A pointer to the next node.</w:t>
+      </w:r>
+    </w:p>
+    <w:p>
+      <w:r>
+        <w:rPr>
+          <w:b/>
+          <w:bCs/>
+        </w:rPr>
+        <w:t>2. A Queue class:</w:t>
+      </w:r>
+    </w:p>
+    <w:p>
+      <w:pPr>
+        <w:numPr>
+          <w:ilvl w:val="0"/>
+          <w:numId w:val="8"/>
+        </w:numPr>
+      </w:pPr>
+      <w:r>
+        <w:t>front: A pointer pointing to the first node in the queue.</w:t>
+      </w:r>
+    </w:p>
+    <w:p>
+      <w:pPr>
+        <w:numPr>
+          <w:ilvl w:val="0"/>
+          <w:numId w:val="8"/>
+        </w:numPr>
+      </w:pPr>
+      <w:r>
+        <w:t>rear: A pointer pointing to the last node in the queue.</w:t>
+      </w:r>
+    </w:p>
+    <w:p>
+      <w:r>
+        <w:rPr>
+          <w:b/>
+          <w:bCs/>
+        </w:rPr>
+        <w:t>3. Required Methods:</w:t>
+      </w:r>
+    </w:p>
+    <w:p>
+      <w:pPr>
+        <w:numPr>
+          <w:ilvl w:val="0"/>
+          <w:numId w:val="9"/>
+        </w:numPr>
+      </w:pPr>
+      <w:r>
+        <w:t>void enqueue(int x): Creates a new node with value x and inserts it at the rear of the queue.</w:t>
+      </w:r>
+    </w:p>
+    <w:p>
+      <w:pPr>
+        <w:numPr>
+          <w:ilvl w:val="0"/>
+          <w:numId w:val="9"/>
+        </w:numPr>
+      </w:pPr>
+      <w:r>
+        <w:t>int dequeue(): Removes the node from the front of the queue and returns its value. If the queue is empty, return -1.</w:t>
+      </w:r>
+    </w:p>
+    <w:p>
+      <w:pPr>
+        <w:numPr>
+          <w:ilvl w:val="0"/>
+          <w:numId w:val="9"/>
+        </w:numPr>
+      </w:pPr>
+      <w:r>
+        <w:t xml:space="preserve">int </w:t>
+      </w:r>
+      <w:proofErr w:type="spellStart"/>
+      <w:r>
+        <w:t>getFront</w:t>
+      </w:r>
+      <w:proofErr w:type="spellEnd"/>
+      <w:r>
+        <w:t>(): Returns the value of the front node without removing it. If the queue is empty, return -1.</w:t>
+      </w:r>
+    </w:p>
+    <w:p>
+      <w:pPr>
+        <w:numPr>
+          <w:ilvl w:val="0"/>
+          <w:numId w:val="9"/>
+        </w:numPr>
+      </w:pPr>
+      <w:r>
+        <w:t xml:space="preserve">bool </w:t>
+      </w:r>
+      <w:proofErr w:type="spellStart"/>
+      <w:r>
+        <w:t>isEmpty</w:t>
+      </w:r>
+      <w:proofErr w:type="spellEnd"/>
+      <w:r>
+        <w:t>(): Returns true if the queue is empty, and false otherwise.</w:t>
+      </w:r>
+    </w:p>
     <w:p/>
     <w:p/>
     <w:sectPr>
@@ -553,6 +737,155 @@
 <file path=word/numbering.xml><?xml version="1.0" encoding="utf-8"?>
 <w:numbering xmlns:wpc="http://schemas.microsoft.com/office/word/2010/wordprocessingCanvas" xmlns:cx="http://schemas.microsoft.com/office/drawing/2014/chartex" xmlns:cx1="http://schemas.microsoft.com/office/drawing/2015/9/8/chartex" xmlns:cx2="http://schemas.microsoft.com/office/drawing/2015/10/21/chartex" xmlns:cx3="http://schemas.microsoft.com/office/drawing/2016/5/9/chartex" xmlns:cx4="http://schemas.microsoft.com/office/drawing/2016/5/10/chartex" xmlns:cx5="http://schemas.microsoft.com/office/drawing/2016/5/11/chartex" xmlns:cx6="http://schemas.microsoft.com/office/drawing/2016/5/12/chartex" xmlns:cx7="http://schemas.microsoft.com/office/drawing/2016/5/13/chartex" xmlns:cx8="http://schemas.microsoft.com/office/drawing/2016/5/14/chartex" xmlns:mc="http://schemas.openxmlformats.org/markup-compatibility/2006" xmlns:aink="http://schemas.microsoft.com/office/drawing/2016/ink" xmlns:am3d="http://schemas.microsoft.com/office/drawing/2017/model3d" xmlns:o="urn:schemas-microsoft-com:office:office" xmlns:oel="http://schemas.microsoft.com/office/2019/extlst" xmlns:r="http://schemas.openxmlformats.org/officeDocument/2006/relationships" xmlns:m="http://schemas.openxmlformats.org/officeDocument/2006/math" xmlns:v="urn:schemas-microsoft-com:vml" xmlns:wp14="http://schemas.microsoft.com/office/word/2010/wordprocessingDrawing" xmlns:wp="http://schemas.openxmlformats.org/drawingml/2006/wordprocessingDrawing" xmlns:w10="urn:schemas-microsoft-com:office:word" xmlns:w="http://schemas.openxmlformats.org/wordprocessingml/2006/main" xmlns:w14="http://schemas.microsoft.com/office/word/2010/wordml" xmlns:w15="http://schemas.microsoft.com/office/word/2012/wordml" xmlns:w16cex="http://schemas.microsoft.com/office/word/2018/wordml/cex" xmlns:w16cid="http://schemas.microsoft.com/office/word/2016/wordml/cid" xmlns:w16="http://schemas.microsoft.com/office/word/2018/wordml" xmlns:w16du="http://schemas.microsoft.com/office/word/2023/wordml/word16du" xmlns:w16sdtdh="http://schemas.microsoft.com/office/word/2020/wordml/sdtdatahash" xmlns:w16sdtfl="http://schemas.microsoft.com/office/word/2024/wordml/sdtformatlock" xmlns:w16se="http://schemas.microsoft.com/office/word/2015/wordml/symex" xmlns:wpg="http://schemas.microsoft.com/office/word/2010/wordprocessingGroup" xmlns:wpi="http://schemas.microsoft.com/office/word/2010/wordprocessingInk" xmlns:wne="http://schemas.microsoft.com/office/word/2006/wordml" xmlns:wps="http://schemas.microsoft.com/office/word/2010/wordprocessingShape" mc:Ignorable="w14 w15 w16se w16cid w16 w16cex w16sdtdh w16sdtfl w16du wp14">
   <w:abstractNum w:abstractNumId="0" w15:restartNumberingAfterBreak="0">
+    <w:nsid w:val="11454303"/>
+    <w:multiLevelType w:val="multilevel"/>
+    <w:tmpl w:val="2EEECA8C"/>
+    <w:lvl w:ilvl="0">
+      <w:start w:val="1"/>
+      <w:numFmt w:val="bullet"/>
+      <w:lvlText w:val=""/>
+      <w:lvlJc w:val="left"/>
+      <w:pPr>
+        <w:tabs>
+          <w:tab w:val="num" w:pos="720"/>
+        </w:tabs>
+        <w:ind w:left="720" w:hanging="360"/>
+      </w:pPr>
+      <w:rPr>
+        <w:rFonts w:ascii="Symbol" w:hAnsi="Symbol" w:hint="default"/>
+        <w:sz w:val="20"/>
+      </w:rPr>
+    </w:lvl>
+    <w:lvl w:ilvl="1" w:tentative="1">
+      <w:start w:val="1"/>
+      <w:numFmt w:val="bullet"/>
+      <w:lvlText w:val="o"/>
+      <w:lvlJc w:val="left"/>
+      <w:pPr>
+        <w:tabs>
+          <w:tab w:val="num" w:pos="1440"/>
+        </w:tabs>
+        <w:ind w:left="1440" w:hanging="360"/>
+      </w:pPr>
+      <w:rPr>
+        <w:rFonts w:ascii="Courier New" w:hAnsi="Courier New" w:hint="default"/>
+        <w:sz w:val="20"/>
+      </w:rPr>
+    </w:lvl>
+    <w:lvl w:ilvl="2" w:tentative="1">
+      <w:start w:val="1"/>
+      <w:numFmt w:val="bullet"/>
+      <w:lvlText w:val=""/>
+      <w:lvlJc w:val="left"/>
+      <w:pPr>
+        <w:tabs>
+          <w:tab w:val="num" w:pos="2160"/>
+        </w:tabs>
+        <w:ind w:left="2160" w:hanging="360"/>
+      </w:pPr>
+      <w:rPr>
+        <w:rFonts w:ascii="Wingdings" w:hAnsi="Wingdings" w:hint="default"/>
+        <w:sz w:val="20"/>
+      </w:rPr>
+    </w:lvl>
+    <w:lvl w:ilvl="3" w:tentative="1">
+      <w:start w:val="1"/>
+      <w:numFmt w:val="bullet"/>
+      <w:lvlText w:val=""/>
+      <w:lvlJc w:val="left"/>
+      <w:pPr>
+        <w:tabs>
+          <w:tab w:val="num" w:pos="2880"/>
+        </w:tabs>
+        <w:ind w:left="2880" w:hanging="360"/>
+      </w:pPr>
+      <w:rPr>
+        <w:rFonts w:ascii="Wingdings" w:hAnsi="Wingdings" w:hint="default"/>
+        <w:sz w:val="20"/>
+      </w:rPr>
+    </w:lvl>
+    <w:lvl w:ilvl="4" w:tentative="1">
+      <w:start w:val="1"/>
+      <w:numFmt w:val="bullet"/>
+      <w:lvlText w:val=""/>
+      <w:lvlJc w:val="left"/>
+      <w:pPr>
+        <w:tabs>
+          <w:tab w:val="num" w:pos="3600"/>
+        </w:tabs>
+        <w:ind w:left="3600" w:hanging="360"/>
+      </w:pPr>
+      <w:rPr>
+        <w:rFonts w:ascii="Wingdings" w:hAnsi="Wingdings" w:hint="default"/>
+        <w:sz w:val="20"/>
+      </w:rPr>
+    </w:lvl>
+    <w:lvl w:ilvl="5" w:tentative="1">
+      <w:start w:val="1"/>
+      <w:numFmt w:val="bullet"/>
+      <w:lvlText w:val=""/>
+      <w:lvlJc w:val="left"/>
+      <w:pPr>
+        <w:tabs>
+          <w:tab w:val="num" w:pos="4320"/>
+        </w:tabs>
+        <w:ind w:left="4320" w:hanging="360"/>
+      </w:pPr>
+      <w:rPr>
+        <w:rFonts w:ascii="Wingdings" w:hAnsi="Wingdings" w:hint="default"/>
+        <w:sz w:val="20"/>
+      </w:rPr>
+    </w:lvl>
+    <w:lvl w:ilvl="6" w:tentative="1">
+      <w:start w:val="1"/>
+      <w:numFmt w:val="bullet"/>
+      <w:lvlText w:val=""/>
+      <w:lvlJc w:val="left"/>
+      <w:pPr>
+        <w:tabs>
+          <w:tab w:val="num" w:pos="5040"/>
+        </w:tabs>
+        <w:ind w:left="5040" w:hanging="360"/>
+      </w:pPr>
+      <w:rPr>
+        <w:rFonts w:ascii="Wingdings" w:hAnsi="Wingdings" w:hint="default"/>
+        <w:sz w:val="20"/>
+      </w:rPr>
+    </w:lvl>
+    <w:lvl w:ilvl="7" w:tentative="1">
+      <w:start w:val="1"/>
+      <w:numFmt w:val="bullet"/>
+      <w:lvlText w:val=""/>
+      <w:lvlJc w:val="left"/>
+      <w:pPr>
+        <w:tabs>
+          <w:tab w:val="num" w:pos="5760"/>
+        </w:tabs>
+        <w:ind w:left="5760" w:hanging="360"/>
+      </w:pPr>
+      <w:rPr>
+        <w:rFonts w:ascii="Wingdings" w:hAnsi="Wingdings" w:hint="default"/>
+        <w:sz w:val="20"/>
+      </w:rPr>
+    </w:lvl>
+    <w:lvl w:ilvl="8" w:tentative="1">
+      <w:start w:val="1"/>
+      <w:numFmt w:val="bullet"/>
+      <w:lvlText w:val=""/>
+      <w:lvlJc w:val="left"/>
+      <w:pPr>
+        <w:tabs>
+          <w:tab w:val="num" w:pos="6480"/>
+        </w:tabs>
+        <w:ind w:left="6480" w:hanging="360"/>
+      </w:pPr>
+      <w:rPr>
+        <w:rFonts w:ascii="Wingdings" w:hAnsi="Wingdings" w:hint="default"/>
+        <w:sz w:val="20"/>
+      </w:rPr>
+    </w:lvl>
+  </w:abstractNum>
+  <w:abstractNum w:abstractNumId="1" w15:restartNumberingAfterBreak="0">
     <w:nsid w:val="131551D3"/>
     <w:multiLevelType w:val="multilevel"/>
     <w:tmpl w:val="B92EA9F2"/>
@@ -701,7 +1034,7 @@
       </w:rPr>
     </w:lvl>
   </w:abstractNum>
-  <w:abstractNum w:abstractNumId="1" w15:restartNumberingAfterBreak="0">
+  <w:abstractNum w:abstractNumId="2" w15:restartNumberingAfterBreak="0">
     <w:nsid w:val="1BBA65C4"/>
     <w:multiLevelType w:val="multilevel"/>
     <w:tmpl w:val="9D38017E"/>
@@ -850,7 +1183,156 @@
       </w:rPr>
     </w:lvl>
   </w:abstractNum>
-  <w:abstractNum w:abstractNumId="2" w15:restartNumberingAfterBreak="0">
+  <w:abstractNum w:abstractNumId="3" w15:restartNumberingAfterBreak="0">
+    <w:nsid w:val="25F15552"/>
+    <w:multiLevelType w:val="multilevel"/>
+    <w:tmpl w:val="E7C86630"/>
+    <w:lvl w:ilvl="0">
+      <w:start w:val="1"/>
+      <w:numFmt w:val="bullet"/>
+      <w:lvlText w:val=""/>
+      <w:lvlJc w:val="left"/>
+      <w:pPr>
+        <w:tabs>
+          <w:tab w:val="num" w:pos="720"/>
+        </w:tabs>
+        <w:ind w:left="720" w:hanging="360"/>
+      </w:pPr>
+      <w:rPr>
+        <w:rFonts w:ascii="Symbol" w:hAnsi="Symbol" w:hint="default"/>
+        <w:sz w:val="20"/>
+      </w:rPr>
+    </w:lvl>
+    <w:lvl w:ilvl="1" w:tentative="1">
+      <w:start w:val="1"/>
+      <w:numFmt w:val="bullet"/>
+      <w:lvlText w:val="o"/>
+      <w:lvlJc w:val="left"/>
+      <w:pPr>
+        <w:tabs>
+          <w:tab w:val="num" w:pos="1440"/>
+        </w:tabs>
+        <w:ind w:left="1440" w:hanging="360"/>
+      </w:pPr>
+      <w:rPr>
+        <w:rFonts w:ascii="Courier New" w:hAnsi="Courier New" w:hint="default"/>
+        <w:sz w:val="20"/>
+      </w:rPr>
+    </w:lvl>
+    <w:lvl w:ilvl="2" w:tentative="1">
+      <w:start w:val="1"/>
+      <w:numFmt w:val="bullet"/>
+      <w:lvlText w:val=""/>
+      <w:lvlJc w:val="left"/>
+      <w:pPr>
+        <w:tabs>
+          <w:tab w:val="num" w:pos="2160"/>
+        </w:tabs>
+        <w:ind w:left="2160" w:hanging="360"/>
+      </w:pPr>
+      <w:rPr>
+        <w:rFonts w:ascii="Wingdings" w:hAnsi="Wingdings" w:hint="default"/>
+        <w:sz w:val="20"/>
+      </w:rPr>
+    </w:lvl>
+    <w:lvl w:ilvl="3" w:tentative="1">
+      <w:start w:val="1"/>
+      <w:numFmt w:val="bullet"/>
+      <w:lvlText w:val=""/>
+      <w:lvlJc w:val="left"/>
+      <w:pPr>
+        <w:tabs>
+          <w:tab w:val="num" w:pos="2880"/>
+        </w:tabs>
+        <w:ind w:left="2880" w:hanging="360"/>
+      </w:pPr>
+      <w:rPr>
+        <w:rFonts w:ascii="Wingdings" w:hAnsi="Wingdings" w:hint="default"/>
+        <w:sz w:val="20"/>
+      </w:rPr>
+    </w:lvl>
+    <w:lvl w:ilvl="4" w:tentative="1">
+      <w:start w:val="1"/>
+      <w:numFmt w:val="bullet"/>
+      <w:lvlText w:val=""/>
+      <w:lvlJc w:val="left"/>
+      <w:pPr>
+        <w:tabs>
+          <w:tab w:val="num" w:pos="3600"/>
+        </w:tabs>
+        <w:ind w:left="3600" w:hanging="360"/>
+      </w:pPr>
+      <w:rPr>
+        <w:rFonts w:ascii="Wingdings" w:hAnsi="Wingdings" w:hint="default"/>
+        <w:sz w:val="20"/>
+      </w:rPr>
+    </w:lvl>
+    <w:lvl w:ilvl="5" w:tentative="1">
+      <w:start w:val="1"/>
+      <w:numFmt w:val="bullet"/>
+      <w:lvlText w:val=""/>
+      <w:lvlJc w:val="left"/>
+      <w:pPr>
+        <w:tabs>
+          <w:tab w:val="num" w:pos="4320"/>
+        </w:tabs>
+        <w:ind w:left="4320" w:hanging="360"/>
+      </w:pPr>
+      <w:rPr>
+        <w:rFonts w:ascii="Wingdings" w:hAnsi="Wingdings" w:hint="default"/>
+        <w:sz w:val="20"/>
+      </w:rPr>
+    </w:lvl>
+    <w:lvl w:ilvl="6" w:tentative="1">
+      <w:start w:val="1"/>
+      <w:numFmt w:val="bullet"/>
+      <w:lvlText w:val=""/>
+      <w:lvlJc w:val="left"/>
+      <w:pPr>
+        <w:tabs>
+          <w:tab w:val="num" w:pos="5040"/>
+        </w:tabs>
+        <w:ind w:left="5040" w:hanging="360"/>
+      </w:pPr>
+      <w:rPr>
+        <w:rFonts w:ascii="Wingdings" w:hAnsi="Wingdings" w:hint="default"/>
+        <w:sz w:val="20"/>
+      </w:rPr>
+    </w:lvl>
+    <w:lvl w:ilvl="7" w:tentative="1">
+      <w:start w:val="1"/>
+      <w:numFmt w:val="bullet"/>
+      <w:lvlText w:val=""/>
+      <w:lvlJc w:val="left"/>
+      <w:pPr>
+        <w:tabs>
+          <w:tab w:val="num" w:pos="5760"/>
+        </w:tabs>
+        <w:ind w:left="5760" w:hanging="360"/>
+      </w:pPr>
+      <w:rPr>
+        <w:rFonts w:ascii="Wingdings" w:hAnsi="Wingdings" w:hint="default"/>
+        <w:sz w:val="20"/>
+      </w:rPr>
+    </w:lvl>
+    <w:lvl w:ilvl="8" w:tentative="1">
+      <w:start w:val="1"/>
+      <w:numFmt w:val="bullet"/>
+      <w:lvlText w:val=""/>
+      <w:lvlJc w:val="left"/>
+      <w:pPr>
+        <w:tabs>
+          <w:tab w:val="num" w:pos="6480"/>
+        </w:tabs>
+        <w:ind w:left="6480" w:hanging="360"/>
+      </w:pPr>
+      <w:rPr>
+        <w:rFonts w:ascii="Wingdings" w:hAnsi="Wingdings" w:hint="default"/>
+        <w:sz w:val="20"/>
+      </w:rPr>
+    </w:lvl>
+  </w:abstractNum>
+  <w:abstractNum w:abstractNumId="4" w15:restartNumberingAfterBreak="0">
     <w:nsid w:val="3B002232"/>
     <w:multiLevelType w:val="multilevel"/>
     <w:tmpl w:val="42007720"/>
@@ -999,7 +1481,7 @@
       </w:rPr>
     </w:lvl>
   </w:abstractNum>
-  <w:abstractNum w:abstractNumId="3" w15:restartNumberingAfterBreak="0">
+  <w:abstractNum w:abstractNumId="5" w15:restartNumberingAfterBreak="0">
     <w:nsid w:val="48505F6E"/>
     <w:multiLevelType w:val="multilevel"/>
     <w:tmpl w:val="836A113A"/>
@@ -1148,7 +1630,7 @@
       </w:rPr>
     </w:lvl>
   </w:abstractNum>
-  <w:abstractNum w:abstractNumId="4" w15:restartNumberingAfterBreak="0">
+  <w:abstractNum w:abstractNumId="6" w15:restartNumberingAfterBreak="0">
     <w:nsid w:val="4BD60798"/>
     <w:multiLevelType w:val="multilevel"/>
     <w:tmpl w:val="EA624F18"/>
@@ -1297,7 +1779,156 @@
       </w:rPr>
     </w:lvl>
   </w:abstractNum>
-  <w:abstractNum w:abstractNumId="5" w15:restartNumberingAfterBreak="0">
+  <w:abstractNum w:abstractNumId="7" w15:restartNumberingAfterBreak="0">
+    <w:nsid w:val="79FB71AA"/>
+    <w:multiLevelType w:val="multilevel"/>
+    <w:tmpl w:val="99FA766E"/>
+    <w:lvl w:ilvl="0">
+      <w:start w:val="1"/>
+      <w:numFmt w:val="bullet"/>
+      <w:lvlText w:val=""/>
+      <w:lvlJc w:val="left"/>
+      <w:pPr>
+        <w:tabs>
+          <w:tab w:val="num" w:pos="720"/>
+        </w:tabs>
+        <w:ind w:left="720" w:hanging="360"/>
+      </w:pPr>
+      <w:rPr>
+        <w:rFonts w:ascii="Symbol" w:hAnsi="Symbol" w:hint="default"/>
+        <w:sz w:val="20"/>
+      </w:rPr>
+    </w:lvl>
+    <w:lvl w:ilvl="1" w:tentative="1">
+      <w:start w:val="1"/>
+      <w:numFmt w:val="bullet"/>
+      <w:lvlText w:val="o"/>
+      <w:lvlJc w:val="left"/>
+      <w:pPr>
+        <w:tabs>
+          <w:tab w:val="num" w:pos="1440"/>
+        </w:tabs>
+        <w:ind w:left="1440" w:hanging="360"/>
+      </w:pPr>
+      <w:rPr>
+        <w:rFonts w:ascii="Courier New" w:hAnsi="Courier New" w:hint="default"/>
+        <w:sz w:val="20"/>
+      </w:rPr>
+    </w:lvl>
+    <w:lvl w:ilvl="2" w:tentative="1">
+      <w:start w:val="1"/>
+      <w:numFmt w:val="bullet"/>
+      <w:lvlText w:val=""/>
+      <w:lvlJc w:val="left"/>
+      <w:pPr>
+        <w:tabs>
+          <w:tab w:val="num" w:pos="2160"/>
+        </w:tabs>
+        <w:ind w:left="2160" w:hanging="360"/>
+      </w:pPr>
+      <w:rPr>
+        <w:rFonts w:ascii="Wingdings" w:hAnsi="Wingdings" w:hint="default"/>
+        <w:sz w:val="20"/>
+      </w:rPr>
+    </w:lvl>
+    <w:lvl w:ilvl="3" w:tentative="1">
+      <w:start w:val="1"/>
+      <w:numFmt w:val="bullet"/>
+      <w:lvlText w:val=""/>
+      <w:lvlJc w:val="left"/>
+      <w:pPr>
+        <w:tabs>
+          <w:tab w:val="num" w:pos="2880"/>
+        </w:tabs>
+        <w:ind w:left="2880" w:hanging="360"/>
+      </w:pPr>
+      <w:rPr>
+        <w:rFonts w:ascii="Wingdings" w:hAnsi="Wingdings" w:hint="default"/>
+        <w:sz w:val="20"/>
+      </w:rPr>
+    </w:lvl>
+    <w:lvl w:ilvl="4" w:tentative="1">
+      <w:start w:val="1"/>
+      <w:numFmt w:val="bullet"/>
+      <w:lvlText w:val=""/>
+      <w:lvlJc w:val="left"/>
+      <w:pPr>
+        <w:tabs>
+          <w:tab w:val="num" w:pos="3600"/>
+        </w:tabs>
+        <w:ind w:left="3600" w:hanging="360"/>
+      </w:pPr>
+      <w:rPr>
+        <w:rFonts w:ascii="Wingdings" w:hAnsi="Wingdings" w:hint="default"/>
+        <w:sz w:val="20"/>
+      </w:rPr>
+    </w:lvl>
+    <w:lvl w:ilvl="5" w:tentative="1">
+      <w:start w:val="1"/>
+      <w:numFmt w:val="bullet"/>
+      <w:lvlText w:val=""/>
+      <w:lvlJc w:val="left"/>
+      <w:pPr>
+        <w:tabs>
+          <w:tab w:val="num" w:pos="4320"/>
+        </w:tabs>
+        <w:ind w:left="4320" w:hanging="360"/>
+      </w:pPr>
+      <w:rPr>
+        <w:rFonts w:ascii="Wingdings" w:hAnsi="Wingdings" w:hint="default"/>
+        <w:sz w:val="20"/>
+      </w:rPr>
+    </w:lvl>
+    <w:lvl w:ilvl="6" w:tentative="1">
+      <w:start w:val="1"/>
+      <w:numFmt w:val="bullet"/>
+      <w:lvlText w:val=""/>
+      <w:lvlJc w:val="left"/>
+      <w:pPr>
+        <w:tabs>
+          <w:tab w:val="num" w:pos="5040"/>
+        </w:tabs>
+        <w:ind w:left="5040" w:hanging="360"/>
+      </w:pPr>
+      <w:rPr>
+        <w:rFonts w:ascii="Wingdings" w:hAnsi="Wingdings" w:hint="default"/>
+        <w:sz w:val="20"/>
+      </w:rPr>
+    </w:lvl>
+    <w:lvl w:ilvl="7" w:tentative="1">
+      <w:start w:val="1"/>
+      <w:numFmt w:val="bullet"/>
+      <w:lvlText w:val=""/>
+      <w:lvlJc w:val="left"/>
+      <w:pPr>
+        <w:tabs>
+          <w:tab w:val="num" w:pos="5760"/>
+        </w:tabs>
+        <w:ind w:left="5760" w:hanging="360"/>
+      </w:pPr>
+      <w:rPr>
+        <w:rFonts w:ascii="Wingdings" w:hAnsi="Wingdings" w:hint="default"/>
+        <w:sz w:val="20"/>
+      </w:rPr>
+    </w:lvl>
+    <w:lvl w:ilvl="8" w:tentative="1">
+      <w:start w:val="1"/>
+      <w:numFmt w:val="bullet"/>
+      <w:lvlText w:val=""/>
+      <w:lvlJc w:val="left"/>
+      <w:pPr>
+        <w:tabs>
+          <w:tab w:val="num" w:pos="6480"/>
+        </w:tabs>
+        <w:ind w:left="6480" w:hanging="360"/>
+      </w:pPr>
+      <w:rPr>
+        <w:rFonts w:ascii="Wingdings" w:hAnsi="Wingdings" w:hint="default"/>
+        <w:sz w:val="20"/>
+      </w:rPr>
+    </w:lvl>
+  </w:abstractNum>
+  <w:abstractNum w:abstractNumId="8" w15:restartNumberingAfterBreak="0">
     <w:nsid w:val="7A683290"/>
     <w:multiLevelType w:val="multilevel"/>
     <w:tmpl w:val="D47E7EF2"/>
@@ -1447,21 +2078,30 @@
     </w:lvl>
   </w:abstractNum>
   <w:num w:numId="1" w16cid:durableId="1069613279">
+    <w:abstractNumId w:val="2"/>
+  </w:num>
+  <w:num w:numId="2" w16cid:durableId="1265696826">
+    <w:abstractNumId w:val="8"/>
+  </w:num>
+  <w:num w:numId="3" w16cid:durableId="273444475">
     <w:abstractNumId w:val="1"/>
   </w:num>
-  <w:num w:numId="2" w16cid:durableId="1265696826">
+  <w:num w:numId="4" w16cid:durableId="1470903993">
+    <w:abstractNumId w:val="6"/>
+  </w:num>
+  <w:num w:numId="5" w16cid:durableId="1152259747">
+    <w:abstractNumId w:val="4"/>
+  </w:num>
+  <w:num w:numId="6" w16cid:durableId="315646026">
     <w:abstractNumId w:val="5"/>
   </w:num>
-  <w:num w:numId="3" w16cid:durableId="273444475">
+  <w:num w:numId="7" w16cid:durableId="1710253042">
+    <w:abstractNumId w:val="7"/>
+  </w:num>
+  <w:num w:numId="8" w16cid:durableId="96141449">
     <w:abstractNumId w:val="0"/>
   </w:num>
-  <w:num w:numId="4" w16cid:durableId="1470903993">
-    <w:abstractNumId w:val="4"/>
-  </w:num>
-  <w:num w:numId="5" w16cid:durableId="1152259747">
-    <w:abstractNumId w:val="2"/>
-  </w:num>
-  <w:num w:numId="6" w16cid:durableId="315646026">
+  <w:num w:numId="9" w16cid:durableId="1515026901">
     <w:abstractNumId w:val="3"/>
   </w:num>
 </w:numbering>

</xml_diff>